<commit_message>
JIKM resubmission: renumber spare table files after the Table 9 move; add tables zip to bundle
Co-Authored-By: Claude Fable 5.1 <noreply@anthropic.com>
Claude-Session: https://claude.ai/code/session_01KoT3i8geZspYBMMKVYJUTG
</commit_message>
<xml_diff>
--- a/docs/papers/publication/jikm_submission_package/resubmission_2026-09-21/tables/Table09.docx
+++ b/docs/papers/publication/jikm_submission_package/resubmission_2026-09-21/tables/Table09.docx
@@ -3,12 +3,9 @@
 <w:document xmlns:wpc="http://schemas.microsoft.com/office/word/2010/wordprocessingCanvas" xmlns:mo="http://schemas.microsoft.com/office/mac/office/2008/main" xmlns:mc="http://schemas.openxmlformats.org/markup-compatibility/2006" xmlns:mv="urn:schemas-microsoft-com:mac:vml" xmlns:o="urn:schemas-microsoft-com:office:office" xmlns:r="http://schemas.openxmlformats.org/officeDocument/2006/relationships" xmlns:m="http://schemas.openxmlformats.org/officeDocument/2006/math" xmlns:v="urn:schemas-microsoft-com:vml" xmlns:wp14="http://schemas.microsoft.com/office/word/2010/wordprocessingDrawing" xmlns:wp="http://schemas.openxmlformats.org/drawingml/2006/wordprocessingDrawing" xmlns:w10="urn:schemas-microsoft-com:office:word" xmlns:w="http://schemas.openxmlformats.org/wordprocessingml/2006/main" xmlns:w14="http://schemas.microsoft.com/office/word/2010/wordml" xmlns:wpg="http://schemas.microsoft.com/office/word/2010/wordprocessingGroup" xmlns:wpi="http://schemas.microsoft.com/office/word/2010/wordprocessingInk" xmlns:wne="http://schemas.microsoft.com/office/word/2006/wordml" xmlns:wps="http://schemas.microsoft.com/office/word/2010/wordprocessingShape" mc:Ignorable="w14 wp14">
   <w:body>
     <w:p>
+      <w:pPr/>
       <w:r>
-        <w:rPr>
-          <w:i/>
-          <w:sz w:val="18"/>
-        </w:rPr>
-        <w:t>Table 9. F4 interview protocol.</w:t>
+        <w:t>Table 9. Qualitative findings, supporting records, and alternative interpretations.</w:t>
       </w:r>
     </w:p>
     <w:tbl>
@@ -31,9 +28,8 @@
             <w:r>
               <w:rPr>
                 <w:b/>
-                <w:sz w:val="18"/>
               </w:rPr>
-              <w:t>Q</w:t>
+              <w:t>Finding</w:t>
             </w:r>
           </w:p>
         </w:tc>
@@ -45,9 +41,8 @@
             <w:r>
               <w:rPr>
                 <w:b/>
-                <w:sz w:val="18"/>
               </w:rPr>
-              <w:t>Question</w:t>
+              <w:t>Supporting record</w:t>
             </w:r>
           </w:p>
         </w:tc>
@@ -59,9 +54,8 @@
             <w:r>
               <w:rPr>
                 <w:b/>
-                <w:sz w:val="18"/>
               </w:rPr>
-              <w:t>Tests</w:t>
+              <w:t>Alternative interpretation</w:t>
             </w:r>
           </w:p>
         </w:tc>
@@ -73,10 +67,7 @@
           </w:tcPr>
           <w:p>
             <w:r>
-              <w:rPr>
-                <w:sz w:val="18"/>
-              </w:rPr>
-              <w:t>1</w:t>
+              <w:t>Collapse sequence: players acknowledged the FRA’s benefits and recorded index gains, met recurring in-game failures across their second and third runs, and gave up despite the gains.</w:t>
             </w:r>
           </w:p>
         </w:tc>
@@ -86,10 +77,7 @@
           </w:tcPr>
           <w:p>
             <w:r>
-              <w:rPr>
-                <w:sz w:val="18"/>
-              </w:rPr>
-              <w:t>Describe what happened in your last session</w:t>
+              <w:t>Contemporaneous researcher field notes, compiled from near-daily therapist reports during the eight-week window; a qualitative sequence with no per-participant counts.</w:t>
             </w:r>
           </w:p>
         </w:tc>
@@ -99,10 +87,7 @@
           </w:tcPr>
           <w:p>
             <w:r>
-              <w:rPr>
-                <w:sz w:val="18"/>
-              </w:rPr>
-              <w:t>Account</w:t>
+              <w:t>Ordinary attrition (novelty wear-off) coinciding with the second and third runs; the ordering rests on the note-taker’s account, not on instrumented timing.</w:t>
             </w:r>
           </w:p>
         </w:tc>
@@ -114,10 +99,7 @@
           </w:tcPr>
           <w:p>
             <w:r>
-              <w:rPr>
-                <w:sz w:val="18"/>
-              </w:rPr>
-              <w:t>2</w:t>
+              <w:t>Visible-dropout social channel: remaining players saw the group thinning as dropouts accumulated, which contributed to further abandonment.</w:t>
             </w:r>
           </w:p>
         </w:tc>
@@ -127,10 +109,7 @@
           </w:tcPr>
           <w:p>
             <w:r>
-              <w:rPr>
-                <w:sz w:val="18"/>
-              </w:rPr>
-              <w:t>How did you feel when the session ended?</w:t>
+              <w:t>Same field-note record, retrieved from the archive during verification.</w:t>
             </w:r>
           </w:p>
         </w:tc>
@@ -140,10 +119,7 @@
           </w:tcPr>
           <w:p>
             <w:r>
-              <w:rPr>
-                <w:sz w:val="18"/>
-              </w:rPr>
-              <w:t>Immediate anxiety</w:t>
+              <w:t>A collective, socially shared narrative about the station (Section XII); visible thinning may reflect, rather than cause, exit decisions already made.</w:t>
             </w:r>
           </w:p>
         </w:tc>
@@ -155,10 +131,7 @@
           </w:tcPr>
           <w:p>
             <w:r>
-              <w:rPr>
-                <w:sz w:val="18"/>
-              </w:rPr>
-              <w:t>3</w:t>
+              <w:t>Verdict-fear stance: ‘the game is fun… but I do not want it telling me where my health problems are’ — a paraphrase compiled from the therapist-recorded interview entry, not a verbatim quotation.</w:t>
             </w:r>
           </w:p>
         </w:tc>
@@ -168,10 +141,7 @@
           </w:tcPr>
           <w:p>
             <w:r>
-              <w:rPr>
-                <w:sz w:val="18"/>
-              </w:rPr>
-              <w:t>When did you decide not to come back?</w:t>
+              <w:t>Stage-2 interview record (therapist-completed forms and centre logbook as the primary record; the researcher’s compilation is secondary).</w:t>
             </w:r>
           </w:p>
         </w:tc>
@@ -181,10 +151,7 @@
           </w:tcPr>
           <w:p>
             <w:r>
-              <w:rPr>
-                <w:sz w:val="18"/>
-              </w:rPr>
-              <w:t>H2: impulsive vs deliberate</w:t>
+              <w:t>The interview record reaches sustained participants and centre managers only; the stance shows the salience of the clinical frame but cannot establish the internal reasons of those who discontinued.</w:t>
             </w:r>
           </w:p>
         </w:tc>
@@ -196,10 +163,7 @@
           </w:tcPr>
           <w:p>
             <w:r>
-              <w:rPr>
-                <w:sz w:val="18"/>
-              </w:rPr>
-              <w:t>4</w:t>
+              <w:t>Satisfaction and observed symptom improvement tracked engagement: 9/9 sustained participants recorded satisfied or very satisfied, against 11/21 in the low-engagement group.</w:t>
             </w:r>
           </w:p>
         </w:tc>
@@ -209,10 +173,7 @@
           </w:tcPr>
           <w:p>
             <w:r>
-              <w:rPr>
-                <w:sz w:val="18"/>
-              </w:rPr>
-              <w:t>What were you thinking about your performance?</w:t>
+              <w:t>Symptom-improvement entries compiled by the researcher from therapists’ near-daily verbal reports (therapists kept no written per-participant records); satisfaction ratings from the after-game questionnaire.</w:t>
             </w:r>
           </w:p>
         </w:tc>
@@ -222,10 +183,7 @@
           </w:tcPr>
           <w:p>
             <w:r>
-              <w:rPr>
-                <w:sz w:val="18"/>
-              </w:rPr>
-              <w:t>H3: health identity</w:t>
+              <w:t>Selection by outcome: the association may run in reverse, longer participation giving more opportunity for improvement and a positive rating; individual attribution of therapist observations was performed by the researcher at compilation.</w:t>
             </w:r>
           </w:p>
         </w:tc>
@@ -237,10 +195,7 @@
           </w:tcPr>
           <w:p>
             <w:r>
-              <w:rPr>
-                <w:sz w:val="18"/>
-              </w:rPr>
-              <w:t>5</w:t>
+              <w:t>Gains without return: most low-engagement participants left despite recorded index gains (group mean +2.8), and three F4-cluster members recorded an improved index in their single completed run yet did not return within the observation window.</w:t>
             </w:r>
           </w:p>
         </w:tc>
@@ -250,10 +205,7 @@
           </w:tcPr>
           <w:p>
             <w:r>
-              <w:rPr>
-                <w:sz w:val="18"/>
-              </w:rPr>
-              <w:t>Did others' opinions matter?</w:t>
+              <w:t>Workbook index records paired with documented non-return within the observation window (no later recorded runs, corroborated by field observation).</w:t>
             </w:r>
           </w:p>
         </w:tc>
@@ -263,10 +215,7 @@
           </w:tcPr>
           <w:p>
             <w:r>
-              <w:rPr>
-                <w:sz w:val="18"/>
-              </w:rPr>
-              <w:t>Social comparison</w:t>
+              <w:t>Recorded gains of this size may reflect measurement variation or familiarisation; and because no clinical numbers were shown on the play screen, non-return need not have been decided in knowledge of the recorded gain.</w:t>
             </w:r>
           </w:p>
         </w:tc>
@@ -278,10 +227,7 @@
           </w:tcPr>
           <w:p>
             <w:r>
-              <w:rPr>
-                <w:sz w:val="18"/>
-              </w:rPr>
-              <w:t>6</w:t>
+              <w:t>Sustained-side puzzlement at non-participation: two of nine interviewees said they did not know why others would not try</w:t>
             </w:r>
           </w:p>
         </w:tc>
@@ -291,10 +237,7 @@
           </w:tcPr>
           <w:p>
             <w:r>
-              <w:rPr>
-                <w:sz w:val="18"/>
-              </w:rPr>
-              <w:t>Did you connect difficulty to your age?</w:t>
+              <w:t>Sustained-participant interview entry record (nine records; archived 10 September 2026)</w:t>
             </w:r>
           </w:p>
         </w:tc>
@@ -304,10 +247,7 @@
           </w:tcPr>
           <w:p>
             <w:r>
-              <w:rPr>
-                <w:sz w:val="18"/>
-              </w:rPr>
-              <w:t>Age attribution</w:t>
+              <w:t>Politeness or interviewer effect; a sustained-only view that cannot describe non-participants' reasons</w:t>
             </w:r>
           </w:p>
         </w:tc>
@@ -319,10 +259,7 @@
           </w:tcPr>
           <w:p>
             <w:r>
-              <w:rPr>
-                <w:sz w:val="18"/>
-              </w:rPr>
-              <w:t>7</w:t>
+              <w:t>Aesthetic criticism co-existing with satisfaction: four of nine criticised the visuals as weak or childish while rating enjoyment 4-5</w:t>
             </w:r>
           </w:p>
         </w:tc>
@@ -332,10 +269,7 @@
           </w:tcPr>
           <w:p>
             <w:r>
-              <w:rPr>
-                <w:sz w:val="18"/>
-              </w:rPr>
-              <w:t>If easier, would you have continued?</w:t>
+              <w:t>Same interview entry record</w:t>
             </w:r>
           </w:p>
         </w:tc>
@@ -345,92 +279,7 @@
           </w:tcPr>
           <w:p>
             <w:r>
-              <w:rPr>
-                <w:sz w:val="18"/>
-              </w:rPr>
-              <w:t>H4: technical vs psychological</w:t>
-            </w:r>
-          </w:p>
-        </w:tc>
-      </w:tr>
-      <w:tr>
-        <w:tc>
-          <w:tcPr>
-            <w:tcW w:type="dxa" w:w="2880"/>
-          </w:tcPr>
-          <w:p>
-            <w:r>
-              <w:rPr>
-                <w:sz w:val="18"/>
-              </w:rPr>
-              <w:t>8</w:t>
-            </w:r>
-          </w:p>
-        </w:tc>
-        <w:tc>
-          <w:tcPr>
-            <w:tcW w:type="dxa" w:w="2880"/>
-          </w:tcPr>
-          <w:p>
-            <w:r>
-              <w:rPr>
-                <w:sz w:val="18"/>
-              </w:rPr>
-              <w:t>Anything that would make you try again?</w:t>
-            </w:r>
-          </w:p>
-        </w:tc>
-        <w:tc>
-          <w:tcPr>
-            <w:tcW w:type="dxa" w:w="2880"/>
-          </w:tcPr>
-          <w:p>
-            <w:r>
-              <w:rPr>
-                <w:sz w:val="18"/>
-              </w:rPr>
-              <w:t>Permanence</w:t>
-            </w:r>
-          </w:p>
-        </w:tc>
-      </w:tr>
-      <w:tr>
-        <w:tc>
-          <w:tcPr>
-            <w:tcW w:type="dxa" w:w="2880"/>
-          </w:tcPr>
-          <w:p>
-            <w:r>
-              <w:rPr>
-                <w:sz w:val="18"/>
-              </w:rPr>
-              <w:t>9</w:t>
-            </w:r>
-          </w:p>
-        </w:tc>
-        <w:tc>
-          <w:tcPr>
-            <w:tcW w:type="dxa" w:w="2880"/>
-          </w:tcPr>
-          <w:p>
-            <w:r>
-              <w:rPr>
-                <w:sz w:val="18"/>
-              </w:rPr>
-              <w:t>If described as a reaction-speed game instead of a health test, would that change how you felt?</w:t>
-            </w:r>
-          </w:p>
-        </w:tc>
-        <w:tc>
-          <w:tcPr>
-            <w:tcW w:type="dxa" w:w="2880"/>
-          </w:tcPr>
-          <w:p>
-            <w:r>
-              <w:rPr>
-                <w:sz w:val="18"/>
-              </w:rPr>
-              <w:t>Domain-reframing probe</w:t>
+              <w:t>Cohort-specific taste; consistent with the infantilisation risk raised in expert consultation, but not evidence of its behavioural effect</w:t>
             </w:r>
           </w:p>
         </w:tc>

</xml_diff>